<commit_message>
docs: update business plan with real two-founder team (Brighton + Kudakwashe Calvin Bhamusi)
</commit_message>
<xml_diff>
--- a/docs/Edu-Sync-Mesh-Business-Plan.docx
+++ b/docs/Edu-Sync-Mesh-Business-Plan.docx
@@ -92,7 +92,7 @@
           <w:sz w:val="20"/>
           <w:szCs w:val="20"/>
         </w:rPr>
-        <w:t xml:space="preserve">Prepared by: Brighton | Zimbabwe Open University</w:t>
+        <w:t xml:space="preserve">Prepared by: Brighton &amp; Kudakwashe Calvin Bhamusi | Zimbabwe Open University</w:t>
       </w:r>
     </w:p>
     <w:p>
@@ -387,7 +387,7 @@
         <w:spacing w:after="160" w:before="320"/>
       </w:pPr>
       <w:r>
-        <w:t xml:space="preserve">2.1 Organisational Structure</w:t>
+        <w:t xml:space="preserve">2.1 Founding Team</w:t>
       </w:r>
     </w:p>
     <w:p>
@@ -396,7 +396,7 @@
         <w:jc w:val="left"/>
       </w:pPr>
       <w:r>
-        <w:t xml:space="preserve">As a student venture entering the pilot phase, Edu-Sync Mesh operates a lean, flat structure. Roles are defined by function rather than seniority, allowing the small founding team to move quickly while remaining accountable for specific deliverables.</w:t>
+        <w:t xml:space="preserve">Edu-Sync Mesh is co-founded and built by a two-person student team. With a small team, both founders share full ownership of the venture's direction, while dividing hands-on execution by strength so that development, design, and documentation can move in parallel.</w:t>
       </w:r>
     </w:p>
     <w:tbl>
@@ -441,7 +441,7 @@
                 <w:bCs/>
                 <w:color w:val="FFFFFF"/>
               </w:rPr>
-              <w:t xml:space="preserve">Role</w:t>
+              <w:t xml:space="preserve">Founder</w:t>
             </w:r>
           </w:p>
         </w:tc>
@@ -466,7 +466,7 @@
                 <w:bCs/>
                 <w:color w:val="FFFFFF"/>
               </w:rPr>
-              <w:t xml:space="preserve">Responsibilities</w:t>
+              <w:t xml:space="preserve">Core Responsibilities</w:t>
             </w:r>
           </w:p>
         </w:tc>
@@ -517,7 +517,8 @@
                 <w:bCs w:val="false"/>
                 <w:color w:val="1B1B1B"/>
               </w:rPr>
-              <w:t xml:space="preserve">Founder / Team Lead</w:t>
+              <w:t xml:space="preserve">Brighton
+Co-Founder / Technical Lead</w:t>
             </w:r>
           </w:p>
         </w:tc>
@@ -541,7 +542,7 @@
                 <w:bCs w:val="false"/>
                 <w:color w:val="1B1B1B"/>
               </w:rPr>
-              <w:t xml:space="preserve">Product vision, stakeholder engagement (Ministry of Education, schools), pitch delivery</w:t>
+              <w:t xml:space="preserve">UI implementation and frontend build, backend and offline-sync architecture, Village Hub hardware/software setup, AI tutor integration, financial planning, and pitch delivery</w:t>
             </w:r>
           </w:p>
         </w:tc>
@@ -565,7 +566,7 @@
                 <w:bCs w:val="false"/>
                 <w:color w:val="1B1B1B"/>
               </w:rPr>
-              <w:t xml:space="preserve">Full-stack development, project management, public speaking</w:t>
+              <w:t xml:space="preserve">Full-stack development (React, Node.js), systems/hardware setup, project management, public speaking</w:t>
             </w:r>
           </w:p>
         </w:tc>
@@ -591,7 +592,8 @@
                 <w:bCs w:val="false"/>
                 <w:color w:val="1B1B1B"/>
               </w:rPr>
-              <w:t xml:space="preserve">Technical Lead (Hardware)</w:t>
+              <w:t xml:space="preserve">Kudakwashe Calvin Bhamusi
+Co-Founder / Design &amp; Documentation Lead</w:t>
             </w:r>
           </w:p>
         </w:tc>
@@ -615,7 +617,7 @@
                 <w:bCs w:val="false"/>
                 <w:color w:val="1B1B1B"/>
               </w:rPr>
-              <w:t xml:space="preserve">Village Hub setup, Raspberry Pi configuration, offline AI model deployment</w:t>
+              <w:t xml:space="preserve">UI/UX design (wireframes, visual design, user flows), technical and business documentation, business plan writing, presentation content support</w:t>
             </w:r>
           </w:p>
         </w:tc>
@@ -639,229 +641,7 @@
                 <w:bCs w:val="false"/>
                 <w:color w:val="1B1B1B"/>
               </w:rPr>
-              <w:t xml:space="preserve">Linux systems administration, networking, embedded devices</w:t>
-            </w:r>
-          </w:p>
-        </w:tc>
-      </w:tr>
-      <w:tr>
-        <w:tc>
-          <w:tcPr>
-            <w:tcW w:type="dxa" w:w="2800"/>
-            <w:tcMar>
-              <w:top w:type="dxa" w:w="100"/>
-              <w:left w:type="dxa" w:w="120"/>
-              <w:bottom w:type="dxa" w:w="100"/>
-              <w:right w:type="dxa" w:w="120"/>
-            </w:tcMar>
-          </w:tcPr>
-          <w:p>
-            <w:pPr>
-              <w:jc w:val="left"/>
-            </w:pPr>
-            <w:r>
-              <w:rPr>
-                <w:b w:val="false"/>
-                <w:bCs w:val="false"/>
-                <w:color w:val="1B1B1B"/>
-              </w:rPr>
-              <w:t xml:space="preserve">Technical Lead (Software)</w:t>
-            </w:r>
-          </w:p>
-        </w:tc>
-        <w:tc>
-          <w:tcPr>
-            <w:tcW w:type="dxa" w:w="3280"/>
-            <w:tcMar>
-              <w:top w:type="dxa" w:w="100"/>
-              <w:left w:type="dxa" w:w="120"/>
-              <w:bottom w:type="dxa" w:w="100"/>
-              <w:right w:type="dxa" w:w="120"/>
-            </w:tcMar>
-          </w:tcPr>
-          <w:p>
-            <w:pPr>
-              <w:jc w:val="left"/>
-            </w:pPr>
-            <w:r>
-              <w:rPr>
-                <w:b w:val="false"/>
-                <w:bCs w:val="false"/>
-                <w:color w:val="1B1B1B"/>
-              </w:rPr>
-              <w:t xml:space="preserve">PWA development, offline-first sync architecture (PouchDB/CouchDB)</w:t>
-            </w:r>
-          </w:p>
-        </w:tc>
-        <w:tc>
-          <w:tcPr>
-            <w:tcW w:type="dxa" w:w="3280"/>
-            <w:tcMar>
-              <w:top w:type="dxa" w:w="100"/>
-              <w:left w:type="dxa" w:w="120"/>
-              <w:bottom w:type="dxa" w:w="100"/>
-              <w:right w:type="dxa" w:w="120"/>
-            </w:tcMar>
-          </w:tcPr>
-          <w:p>
-            <w:pPr>
-              <w:jc w:val="left"/>
-            </w:pPr>
-            <w:r>
-              <w:rPr>
-                <w:b w:val="false"/>
-                <w:bCs w:val="false"/>
-                <w:color w:val="1B1B1B"/>
-              </w:rPr>
-              <w:t xml:space="preserve">React, Node.js, database design</w:t>
-            </w:r>
-          </w:p>
-        </w:tc>
-      </w:tr>
-      <w:tr>
-        <w:tc>
-          <w:tcPr>
-            <w:tcW w:type="dxa" w:w="2800"/>
-            <w:tcMar>
-              <w:top w:type="dxa" w:w="100"/>
-              <w:left w:type="dxa" w:w="120"/>
-              <w:bottom w:type="dxa" w:w="100"/>
-              <w:right w:type="dxa" w:w="120"/>
-            </w:tcMar>
-          </w:tcPr>
-          <w:p>
-            <w:pPr>
-              <w:jc w:val="left"/>
-            </w:pPr>
-            <w:r>
-              <w:rPr>
-                <w:b w:val="false"/>
-                <w:bCs w:val="false"/>
-                <w:color w:val="1B1B1B"/>
-              </w:rPr>
-              <w:t xml:space="preserve">Content &amp; Partnerships Coordinator</w:t>
-            </w:r>
-          </w:p>
-        </w:tc>
-        <w:tc>
-          <w:tcPr>
-            <w:tcW w:type="dxa" w:w="3280"/>
-            <w:tcMar>
-              <w:top w:type="dxa" w:w="100"/>
-              <w:left w:type="dxa" w:w="120"/>
-              <w:bottom w:type="dxa" w:w="100"/>
-              <w:right w:type="dxa" w:w="120"/>
-            </w:tcMar>
-          </w:tcPr>
-          <w:p>
-            <w:pPr>
-              <w:jc w:val="left"/>
-            </w:pPr>
-            <w:r>
-              <w:rPr>
-                <w:b w:val="false"/>
-                <w:bCs w:val="false"/>
-                <w:color w:val="1B1B1B"/>
-              </w:rPr>
-              <w:t xml:space="preserve">ZIMSEC curriculum sourcing, teacher training material, school partnerships</w:t>
-            </w:r>
-          </w:p>
-        </w:tc>
-        <w:tc>
-          <w:tcPr>
-            <w:tcW w:type="dxa" w:w="3280"/>
-            <w:tcMar>
-              <w:top w:type="dxa" w:w="100"/>
-              <w:left w:type="dxa" w:w="120"/>
-              <w:bottom w:type="dxa" w:w="100"/>
-              <w:right w:type="dxa" w:w="120"/>
-            </w:tcMar>
-          </w:tcPr>
-          <w:p>
-            <w:pPr>
-              <w:jc w:val="left"/>
-            </w:pPr>
-            <w:r>
-              <w:rPr>
-                <w:b w:val="false"/>
-                <w:bCs w:val="false"/>
-                <w:color w:val="1B1B1B"/>
-              </w:rPr>
-              <w:t xml:space="preserve">Curriculum knowledge, relationship management</w:t>
-            </w:r>
-          </w:p>
-        </w:tc>
-      </w:tr>
-      <w:tr>
-        <w:tc>
-          <w:tcPr>
-            <w:tcW w:type="dxa" w:w="2800"/>
-            <w:tcMar>
-              <w:top w:type="dxa" w:w="100"/>
-              <w:left w:type="dxa" w:w="120"/>
-              <w:bottom w:type="dxa" w:w="100"/>
-              <w:right w:type="dxa" w:w="120"/>
-            </w:tcMar>
-          </w:tcPr>
-          <w:p>
-            <w:pPr>
-              <w:jc w:val="left"/>
-            </w:pPr>
-            <w:r>
-              <w:rPr>
-                <w:b w:val="false"/>
-                <w:bCs w:val="false"/>
-                <w:color w:val="1B1B1B"/>
-              </w:rPr>
-              <w:t xml:space="preserve">Finance &amp; Operations</w:t>
-            </w:r>
-          </w:p>
-        </w:tc>
-        <w:tc>
-          <w:tcPr>
-            <w:tcW w:type="dxa" w:w="3280"/>
-            <w:tcMar>
-              <w:top w:type="dxa" w:w="100"/>
-              <w:left w:type="dxa" w:w="120"/>
-              <w:bottom w:type="dxa" w:w="100"/>
-              <w:right w:type="dxa" w:w="120"/>
-            </w:tcMar>
-          </w:tcPr>
-          <w:p>
-            <w:pPr>
-              <w:jc w:val="left"/>
-            </w:pPr>
-            <w:r>
-              <w:rPr>
-                <w:b w:val="false"/>
-                <w:bCs w:val="false"/>
-                <w:color w:val="1B1B1B"/>
-              </w:rPr>
-              <w:t xml:space="preserve">Budget tracking, grant/sponsorship applications, pilot logistics</w:t>
-            </w:r>
-          </w:p>
-        </w:tc>
-        <w:tc>
-          <w:tcPr>
-            <w:tcW w:type="dxa" w:w="3280"/>
-            <w:tcMar>
-              <w:top w:type="dxa" w:w="100"/>
-              <w:left w:type="dxa" w:w="120"/>
-              <w:bottom w:type="dxa" w:w="100"/>
-              <w:right w:type="dxa" w:w="120"/>
-            </w:tcMar>
-          </w:tcPr>
-          <w:p>
-            <w:pPr>
-              <w:jc w:val="left"/>
-            </w:pPr>
-            <w:r>
-              <w:rPr>
-                <w:b w:val="false"/>
-                <w:bCs w:val="false"/>
-                <w:color w:val="1B1B1B"/>
-              </w:rPr>
-              <w:t xml:space="preserve">Financial planning, reporting</w:t>
+              <w:t xml:space="preserve">UI/UX design, technical writing, documentation, presentation design</w:t>
             </w:r>
           </w:p>
         </w:tc>
@@ -935,7 +715,7 @@
         <w:jc w:val="left"/>
       </w:pPr>
       <w:r>
-        <w:t xml:space="preserve">During the pilot phase, decisions are made by consensus within the founding team, with the Team Lead holding final say on scope and timeline to keep delivery on schedule. As the venture scales past the pilot (Section 4.3), a formal advisory board will be established including a Ministry of Education representative and a school principal from a partner district.</w:t>
+        <w:t xml:space="preserve">As a two-person founding team, Brighton and Kudakwashe make product and strategic decisions jointly. Brighton leads technical execution and external technical representation (e.g. Village Hub demonstrations); Kudakwashe leads design direction and documentation integrity, including ensuring all materials submitted for judging are complete and consistent. As the venture scales past the pilot (Section 4.3), a formal advisory board will be established including a Ministry of Education representative and a school principal from a partner district, and additional team members will be recruited for content partnerships and finance.</w:t>
       </w:r>
     </w:p>
     <w:p>
@@ -3135,7 +2915,16 @@
         <w:jc w:val="left"/>
       </w:pPr>
       <w:r>
-        <w:t xml:space="preserve">Brighton — Zimbabwe Open University, BSc Information Technology</w:t>
+        <w:t xml:space="preserve">Brighton — Co-Founder / Technical Lead, Zimbabwe Open University, BSc Information Technology</w:t>
+      </w:r>
+    </w:p>
+    <w:p>
+      <w:pPr>
+        <w:spacing w:after="160"/>
+        <w:jc w:val="left"/>
+      </w:pPr>
+      <w:r>
+        <w:t xml:space="preserve">Kudakwashe Calvin Bhamusi — Co-Founder / Design &amp; Documentation Lead</w:t>
       </w:r>
     </w:p>
     <w:p>

</xml_diff>

<commit_message>
docs: add ZOU logo to business plan cover page
</commit_message>
<xml_diff>
--- a/docs/Edu-Sync-Mesh-Business-Plan.docx
+++ b/docs/Edu-Sync-Mesh-Business-Plan.docx
@@ -4,7 +4,57 @@
   <w:body>
     <w:p>
       <w:pPr>
-        <w:spacing w:before="1600"/>
+        <w:spacing w:before="900"/>
+      </w:pPr>
+    </w:p>
+    <w:p>
+      <w:pPr>
+        <w:jc w:val="center"/>
+      </w:pPr>
+      <w:r>
+        <w:drawing>
+          <wp:inline distT="0" distB="0" distL="0" distR="0">
+            <wp:extent cx="752475" cy="819150"/>
+            <wp:effectExtent t="0" r="0" b="0" l="0"/>
+            <wp:docPr id="1" name="" descr="" title=""/>
+            <wp:cNvGraphicFramePr>
+              <a:graphicFrameLocks xmlns:a="http://schemas.openxmlformats.org/drawingml/2006/main" noChangeAspect="1"/>
+            </wp:cNvGraphicFramePr>
+            <a:graphic xmlns:a="http://schemas.openxmlformats.org/drawingml/2006/main">
+              <a:graphicData uri="http://schemas.openxmlformats.org/drawingml/2006/picture">
+                <pic:pic xmlns:pic="http://schemas.openxmlformats.org/drawingml/2006/picture">
+                  <pic:nvPicPr>
+                    <pic:cNvPr id="0" name="" descr=""/>
+                    <pic:cNvPicPr>
+                      <a:picLocks noChangeAspect="1" noChangeArrowheads="1"/>
+                    </pic:cNvPicPr>
+                  </pic:nvPicPr>
+                  <pic:blipFill>
+                    <a:blip r:embed="rId7" cstate="none"/>
+                    <a:srcRect/>
+                    <a:stretch>
+                      <a:fillRect/>
+                    </a:stretch>
+                  </pic:blipFill>
+                  <pic:spPr bwMode="auto">
+                    <a:xfrm>
+                      <a:off x="0" y="0"/>
+                      <a:ext cx="752475" cy="819150"/>
+                    </a:xfrm>
+                    <a:prstGeom prst="rect">
+                      <a:avLst/>
+                    </a:prstGeom>
+                  </pic:spPr>
+                </pic:pic>
+              </a:graphicData>
+            </a:graphic>
+          </wp:inline>
+        </w:drawing>
+      </w:r>
+    </w:p>
+    <w:p>
+      <w:pPr>
+        <w:spacing w:before="400"/>
       </w:pPr>
     </w:p>
     <w:p>

</xml_diff>

<commit_message>
docs: add faded ZOU watermark to every page of business plan
</commit_message>
<xml_diff>
--- a/docs/Edu-Sync-Mesh-Business-Plan.docx
+++ b/docs/Edu-Sync-Mesh-Business-Plan.docx
@@ -30,7 +30,7 @@
                     </pic:cNvPicPr>
                   </pic:nvPicPr>
                   <pic:blipFill>
-                    <a:blip r:embed="rId7" cstate="none"/>
+                    <a:blip r:embed="rId8" cstate="none"/>
                     <a:srcRect/>
                     <a:stretch>
                       <a:fillRect/>
@@ -2987,6 +2987,7 @@
       </w:r>
     </w:p>
     <w:sectPr>
+      <w:headerReference w:type="default" r:id="rId7"/>
       <w:pgSz w:w="12240" w:h="15840" w:orient="portrait"/>
       <w:pgMar w:top="1080" w:right="1080" w:bottom="1080" w:left="1080" w:header="708" w:footer="708" w:gutter="0"/>
       <w:pgNumType/>
@@ -3072,6 +3073,61 @@
     </w:p>
   </w:footnote>
 </w:footnotes>
+</file>
+
+<file path=word/header1.xml><?xml version="1.0" encoding="utf-8"?>
+<w:hdr xmlns:wpc="http://schemas.microsoft.com/office/word/2010/wordprocessingCanvas" xmlns:mc="http://schemas.openxmlformats.org/markup-compatibility/2006" xmlns:o="urn:schemas-microsoft-com:office:office" xmlns:r="http://schemas.openxmlformats.org/officeDocument/2006/relationships" xmlns:m="http://schemas.openxmlformats.org/officeDocument/2006/math" xmlns:v="urn:schemas-microsoft-com:vml" xmlns:wp14="http://schemas.microsoft.com/office/word/2010/wordprocessingDrawing" xmlns:wp="http://schemas.openxmlformats.org/drawingml/2006/wordprocessingDrawing" xmlns:w10="urn:schemas-microsoft-com:office:word" xmlns:w="http://schemas.openxmlformats.org/wordprocessingml/2006/main" xmlns:w14="http://schemas.microsoft.com/office/word/2010/wordml" xmlns:w15="http://schemas.microsoft.com/office/word/2012/wordml" xmlns:wpg="http://schemas.microsoft.com/office/word/2010/wordprocessingGroup" xmlns:wpi="http://schemas.microsoft.com/office/word/2010/wordprocessingInk" xmlns:wne="http://schemas.microsoft.com/office/word/2006/wordml" xmlns:wps="http://schemas.microsoft.com/office/word/2010/wordprocessingShape" xmlns:cx="http://schemas.microsoft.com/office/drawing/2014/chartex" xmlns:cx1="http://schemas.microsoft.com/office/drawing/2015/9/8/chartex" xmlns:cx2="http://schemas.microsoft.com/office/drawing/2015/10/21/chartex" xmlns:cx3="http://schemas.microsoft.com/office/drawing/2016/5/9/chartex" xmlns:cx4="http://schemas.microsoft.com/office/drawing/2016/5/10/chartex" xmlns:cx5="http://schemas.microsoft.com/office/drawing/2016/5/11/chartex" xmlns:cx6="http://schemas.microsoft.com/office/drawing/2016/5/12/chartex" xmlns:cx7="http://schemas.microsoft.com/office/drawing/2016/5/13/chartex" xmlns:cx8="http://schemas.microsoft.com/office/drawing/2016/5/14/chartex" xmlns:w16cid="http://schemas.microsoft.com/office/word/2016/wordml/cid" xmlns:w16se="http://schemas.microsoft.com/office/word/2015/wordml/symex">
+  <w:p>
+    <w:r>
+      <w:drawing>
+        <wp:anchor distT="0" distB="0" distL="0" distR="0" simplePos="0" allowOverlap="1" behindDoc="1" locked="0" layoutInCell="1" relativeHeight="3352800">
+          <wp:simplePos x="0" y="0"/>
+          <wp:positionH relativeFrom="page">
+            <wp:align>center</wp:align>
+          </wp:positionH>
+          <wp:positionV relativeFrom="page">
+            <wp:align>center</wp:align>
+          </wp:positionV>
+          <wp:extent cx="3048000" cy="3352800"/>
+          <wp:effectExtent t="0" r="0" b="0" l="0"/>
+          <wp:wrapNone/>
+          <wp:docPr id="1" name="" descr="" title=""/>
+          <wp:cNvGraphicFramePr>
+            <a:graphicFrameLocks xmlns:a="http://schemas.openxmlformats.org/drawingml/2006/main" noChangeAspect="1"/>
+          </wp:cNvGraphicFramePr>
+          <a:graphic xmlns:a="http://schemas.openxmlformats.org/drawingml/2006/main">
+            <a:graphicData uri="http://schemas.openxmlformats.org/drawingml/2006/picture">
+              <pic:pic xmlns:pic="http://schemas.openxmlformats.org/drawingml/2006/picture">
+                <pic:nvPicPr>
+                  <pic:cNvPr id="0" name="" descr=""/>
+                  <pic:cNvPicPr>
+                    <a:picLocks noChangeAspect="1" noChangeArrowheads="1"/>
+                  </pic:cNvPicPr>
+                </pic:nvPicPr>
+                <pic:blipFill>
+                  <a:blip r:embed="rId0" cstate="none"/>
+                  <a:srcRect/>
+                  <a:stretch>
+                    <a:fillRect/>
+                  </a:stretch>
+                </pic:blipFill>
+                <pic:spPr bwMode="auto">
+                  <a:xfrm>
+                    <a:off x="0" y="0"/>
+                    <a:ext cx="3048000" cy="3352800"/>
+                  </a:xfrm>
+                  <a:prstGeom prst="rect">
+                    <a:avLst/>
+                  </a:prstGeom>
+                </pic:spPr>
+              </pic:pic>
+            </a:graphicData>
+          </a:graphic>
+        </wp:anchor>
+      </w:drawing>
+    </w:r>
+  </w:p>
+</w:hdr>
 </file>
 
 <file path=word/numbering.xml><?xml version="1.0" encoding="utf-8"?>

</xml_diff>

<commit_message>
feat: Village Hub backend, teacher uploads, ZIMSEC past papers, modularized tabs, demo playbook
Brings the repo up to date with everything built since the last push:
real Express backend with persistent Q&A storage, real Data Mule Sync
with Wikipedia lookup, teacher video/PDF upload with ZIMSEC metadata,
App.jsx modularized into tab components, and finalized pitch materials
(demo playbook, updated deck, updated business plan).
</commit_message>
<xml_diff>
--- a/docs/Edu-Sync-Mesh-Business-Plan.docx
+++ b/docs/Edu-Sync-Mesh-Business-Plan.docx
@@ -352,7 +352,7 @@
         <w:spacing w:after="80"/>
       </w:pPr>
       <w:r>
-        <w:t xml:space="preserve">Data Mule Sync Protocol — a novel synchronisation method where a trusted commuter (a teacher, bus driver, or parent) carries content updates between town and village automatically via their phone — no fibre cable required.</w:t>
+        <w:t xml:space="preserve">Data Mule Sync Protocol — a novel synchronisation method where a trusted commuter (a teacher, bus driver, or parent) carries content updates between town and village automatically via their phone or a USB flash drive — no fibre cable required.</w:t>
       </w:r>
     </w:p>
     <w:p>
@@ -365,7 +365,16 @@
         <w:spacing w:after="80"/>
       </w:pPr>
       <w:r>
-        <w:t xml:space="preserve">Gamified Peer-to-Peer Sharing — a Progressive Web App (PWA) that lets students share downloaded lessons directly with each other over Wi-Fi Direct, earning “Edu-Coins” for every share.</w:t>
+        <w:t xml:space="preserve">Gamified Peer-to-Peer Sharing — a Progressive Web App (PWA) that lets students share downloaded lessons directly with each other over Wi-Fi Direct, earning “Edu-Coins” for every share, with shared content genuinely added to the recipient's library.</w:t>
+      </w:r>
+    </w:p>
+    <w:p>
+      <w:pPr>
+        <w:spacing w:after="160"/>
+        <w:jc w:val="left"/>
+      </w:pPr>
+      <w:r>
+        <w:t xml:space="preserve">Prototype status: a working prototype already implements this architecture end-to-end — a real backend server with persistent storage, a Data Mule Sync that performs a genuine internet lookup for questions the offline knowledge base cannot answer, teacher-uploaded video lessons and ZIMSEC past papers, and an AI tutor that honestly flags the limits of its local knowledge rather than guessing. Source code: github.com/BR-Codeio/edu-sync-mesh.</w:t>
       </w:r>
     </w:p>
     <w:p>
@@ -1621,7 +1630,7 @@
         <w:spacing w:after="80"/>
       </w:pPr>
       <w:r>
-        <w:t xml:space="preserve">Hardware: Raspberry Pi 4 (4GB), 128GB microSD card, 12V battery, optional 100W solar panel — approx. $50 total per Village Hub.</w:t>
+        <w:t xml:space="preserve">Hardware (production target): Raspberry Pi 4 (4GB), 128GB microSD card, 12V battery, optional 100W solar panel — approx. $50 total per Village Hub.</w:t>
       </w:r>
     </w:p>
     <w:p>
@@ -1634,7 +1643,7 @@
         <w:spacing w:after="80"/>
       </w:pPr>
       <w:r>
-        <w:t xml:space="preserve">Software: Node.js/Express server, CouchDB database, quantized offline LLM (Llama-3-8B, Q4_K_M — ~4.5GB), React/Vite Progressive Web App with PouchDB for client-side offline sync.</w:t>
+        <w:t xml:space="preserve">Software (prototype, working today): Node.js/Express backend with persistent file-based storage, React/Vite Progressive Web App, real teacher upload for video lessons and PDF past papers, and a Data Mule Sync that performs a genuine internet lookup (currently via a free public API) for questions the offline knowledge base cannot answer — with every resolved answer saved permanently for all future students.</w:t>
       </w:r>
     </w:p>
     <w:p>
@@ -1647,7 +1656,20 @@
         <w:spacing w:after="80"/>
       </w:pPr>
       <w:r>
-        <w:t xml:space="preserve">Content: Digitised ZIMSEC-approved textbooks, 10–15 minute video lessons, past exam questions with worked solutions, audio-only fallback lessons for low-storage devices.</w:t>
+        <w:t xml:space="preserve">Software (production target): CouchDB in place of the current JSON file store for multi-device replication, a quantized offline LLM (e.g. Llama-3-8B, Q4_K_M) in place of the current curated knowledge base, and PouchDB for client-side offline sync.</w:t>
+      </w:r>
+    </w:p>
+    <w:p>
+      <w:pPr>
+        <w:pStyle w:val="ListParagraph"/>
+        <w:numPr>
+          <w:ilvl w:val="0"/>
+          <w:numId w:val="2"/>
+        </w:numPr>
+        <w:spacing w:after="80"/>
+      </w:pPr>
+      <w:r>
+        <w:t xml:space="preserve">Content: Digitised ZIMSEC-approved textbooks, video lessons, official specimen papers and syllabi, past exam questions with worked solutions, audio-only fallback lessons for low-storage devices. Content uploads include a copyright reminder directing teachers toward officially released or rights-cleared material.</w:t>
       </w:r>
     </w:p>
     <w:p>

</xml_diff>